<commit_message>
Deployed 97ffe2a with MkDocs version: 1.6.1
</commit_message>
<xml_diff>
--- a/01-webdizajn/subory/zadanie-webu-priklad-dorucovanie.docx
+++ b/01-webdizajn/subory/zadanie-webu-priklad-dorucovanie.docx
@@ -53,7 +53,7 @@
     <w:p>
       <w:pPr>
         <w:pStyle w:val="Normlnywebov"/>
-        <w:divId w:val="1275559494"/>
+        <w:divId w:val="328019382"/>
         <w:rPr>
           <w:rFonts w:ascii="Calibri" w:hAnsi="Calibri" w:cs="Calibri"/>
           <w:sz w:val="22"/>
@@ -772,25 +772,79 @@
     </w:p>
     <w:p>
       <w:pPr>
-        <w:pStyle w:val="Nadpis2"/>
-        <w:rPr>
-          <w:rFonts w:ascii="Calibri" w:eastAsia="Times New Roman" w:hAnsi="Calibri" w:cs="Calibri"/>
-        </w:rPr>
-      </w:pPr>
-      <w:r>
-        <w:rPr>
-          <w:rFonts w:ascii="Calibri" w:eastAsia="Times New Roman" w:hAnsi="Calibri" w:cs="Calibri"/>
-        </w:rPr>
-        <w:t>4. Obrazovky</w:t>
-      </w:r>
-    </w:p>
-    <w:p>
-      <w:pPr>
         <w:pStyle w:val="Normlnywebov"/>
         <w:rPr>
           <w:rFonts w:ascii="Calibri" w:hAnsi="Calibri" w:cs="Calibri"/>
           <w:sz w:val="22"/>
           <w:szCs w:val="22"/>
+        </w:rPr>
+      </w:pPr>
+      <w:r>
+        <w:rPr>
+          <w:rFonts w:ascii="Calibri" w:hAnsi="Calibri" w:cs="Calibri"/>
+          <w:noProof/>
+          <w:sz w:val="22"/>
+          <w:szCs w:val="22"/>
+        </w:rPr>
+        <w:lastRenderedPageBreak/>
+        <w:drawing>
+          <wp:inline distT="0" distB="0" distL="0" distR="0" wp14:anchorId="036BEC6E" wp14:editId="621655E6">
+            <wp:extent cx="5710555" cy="11980952"/>
+            <wp:effectExtent l="0" t="0" r="4445" b="1905"/>
+            <wp:docPr id="1" name="Obrázok 1"/>
+            <wp:cNvGraphicFramePr>
+              <a:graphicFrameLocks xmlns:a="http://schemas.openxmlformats.org/drawingml/2006/main" noChangeAspect="1"/>
+            </wp:cNvGraphicFramePr>
+            <a:graphic xmlns:a="http://schemas.openxmlformats.org/drawingml/2006/main">
+              <a:graphicData uri="http://schemas.openxmlformats.org/drawingml/2006/picture">
+                <pic:pic xmlns:pic="http://schemas.openxmlformats.org/drawingml/2006/picture">
+                  <pic:nvPicPr>
+                    <pic:cNvPr id="0" name="Picture 1"/>
+                    <pic:cNvPicPr>
+                      <a:picLocks noChangeAspect="1" noChangeArrowheads="1"/>
+                    </pic:cNvPicPr>
+                  </pic:nvPicPr>
+                  <pic:blipFill>
+                    <a:blip r:embed="rId5">
+                      <a:extLst>
+                        <a:ext uri="{28A0092B-C50C-407E-A947-70E740481C1C}">
+                          <a14:useLocalDpi xmlns:a14="http://schemas.microsoft.com/office/drawing/2010/main" val="0"/>
+                        </a:ext>
+                      </a:extLst>
+                    </a:blip>
+                    <a:srcRect/>
+                    <a:stretch>
+                      <a:fillRect/>
+                    </a:stretch>
+                  </pic:blipFill>
+                  <pic:spPr bwMode="auto">
+                    <a:xfrm>
+                      <a:off x="0" y="0"/>
+                      <a:ext cx="5710555" cy="11980952"/>
+                    </a:xfrm>
+                    <a:prstGeom prst="rect">
+                      <a:avLst/>
+                    </a:prstGeom>
+                    <a:noFill/>
+                    <a:ln>
+                      <a:noFill/>
+                    </a:ln>
+                  </pic:spPr>
+                </pic:pic>
+              </a:graphicData>
+            </a:graphic>
+          </wp:inline>
+        </w:drawing>
+      </w:r>
+    </w:p>
+    <w:p>
+      <w:pPr>
+        <w:pStyle w:val="Normlnywebov"/>
+        <w:rPr>
+          <w:rFonts w:ascii="Calibri" w:hAnsi="Calibri" w:cs="Calibri"/>
+          <w:color w:val="555555"/>
+          <w:sz w:val="18"/>
+          <w:szCs w:val="18"/>
         </w:rPr>
       </w:pPr>
       <w:r>
@@ -798,10 +852,25 @@
           <w:rFonts w:ascii="Calibri" w:hAnsi="Calibri" w:cs="Calibri"/>
           <w:i/>
           <w:iCs/>
-          <w:sz w:val="22"/>
-          <w:szCs w:val="22"/>
-        </w:rPr>
-        <w:t>(V odovzdávanom briefe sú v tejto časti aj screenshoty z interaktívneho prototypu; pre AI sú obrazovky opísané textovo.)</w:t>
+          <w:color w:val="555555"/>
+          <w:sz w:val="18"/>
+          <w:szCs w:val="18"/>
+        </w:rPr>
+        <w:t>Obr. 1 — Informačná architektúra ako mind mapa (Coggle) — rovnaká štruktúra ako zoznam vyššie.</w:t>
+      </w:r>
+    </w:p>
+    <w:p>
+      <w:pPr>
+        <w:pStyle w:val="Nadpis2"/>
+        <w:rPr>
+          <w:rFonts w:ascii="Calibri" w:eastAsia="Times New Roman" w:hAnsi="Calibri" w:cs="Calibri"/>
+        </w:rPr>
+      </w:pPr>
+      <w:r>
+        <w:rPr>
+          <w:rFonts w:ascii="Calibri" w:eastAsia="Times New Roman" w:hAnsi="Calibri" w:cs="Calibri"/>
+        </w:rPr>
+        <w:t>4. Obrazovky</w:t>
       </w:r>
     </w:p>
     <w:p>
@@ -813,31 +882,37 @@
           <w:szCs w:val="22"/>
         </w:rPr>
       </w:pPr>
+      <w:r>
+        <w:rPr>
+          <w:rFonts w:ascii="Calibri" w:hAnsi="Calibri" w:cs="Calibri"/>
+          <w:i/>
+          <w:iCs/>
+          <w:sz w:val="22"/>
+          <w:szCs w:val="22"/>
+        </w:rPr>
+        <w:t xml:space="preserve">(Obrazovky sú opísané textovo a kľúčové z nich doplnené screenshotmi z interaktívneho prototypu. Súčasťou zadania je aj spustiteľný interaktívny prototyp — zdrojový súbor </w:t>
+      </w:r>
       <w:r>
         <w:rPr>
           <w:rFonts w:ascii="Calibri" w:hAnsi="Calibri" w:cs="Calibri"/>
           <w:b/>
           <w:bCs/>
-          <w:sz w:val="22"/>
-          <w:szCs w:val="22"/>
-        </w:rPr>
-        <w:t>4.1 Prihlásenie / registrácia.</w:t>
-      </w:r>
-      <w:r>
-        <w:rPr>
-          <w:rFonts w:ascii="Calibri" w:hAnsi="Calibri" w:cs="Calibri"/>
-          <w:sz w:val="22"/>
-          <w:szCs w:val="22"/>
-        </w:rPr>
-        <w:t xml:space="preserve"> </w:t>
-      </w:r>
-      <w:r>
-        <w:rPr>
-          <w:rFonts w:ascii="Calibri" w:hAnsi="Calibri" w:cs="Calibri"/>
-          <w:sz w:val="22"/>
-          <w:szCs w:val="22"/>
-        </w:rPr>
-        <w:t>Najdôležitejšie: dostať používateľa čo najrýchlejšie dnu. Polia e-mail a heslo, tlačidlo „Prihlásiť sa" vedie na Monitoring; odkaz „Registrovať firmu" vedie na krátky registračný formulár (názov firmy, e-mail, heslo). Kurzor je po načítaní aktívny v poli e-mail.</w:t>
+          <w:i/>
+          <w:iCs/>
+          <w:sz w:val="22"/>
+          <w:szCs w:val="22"/>
+        </w:rPr>
+        <w:t>axure-vzor.rp</w:t>
+      </w:r>
+      <w:r>
+        <w:rPr>
+          <w:rFonts w:ascii="Calibri" w:hAnsi="Calibri" w:cs="Calibri"/>
+          <w:i/>
+          <w:iCs/>
+          <w:sz w:val="22"/>
+          <w:szCs w:val="22"/>
+        </w:rPr>
+        <w:t xml:space="preserve"> pre Axure RP.)</w:t>
       </w:r>
     </w:p>
     <w:p>
@@ -857,24 +932,26 @@
           <w:sz w:val="22"/>
           <w:szCs w:val="22"/>
         </w:rPr>
-        <w:t>4.2 Monitoring — hlavná obrazovka.</w:t>
-      </w:r>
-      <w:r>
-        <w:rPr>
-          <w:rFonts w:ascii="Calibri" w:hAnsi="Calibri" w:cs="Calibri"/>
-          <w:sz w:val="22"/>
-          <w:szCs w:val="22"/>
-        </w:rPr>
-        <w:t xml:space="preserve"> </w:t>
-      </w:r>
-      <w:r>
-        <w:rPr>
-          <w:rFonts w:ascii="Calibri" w:hAnsi="Calibri" w:cs="Calibri"/>
-          <w:sz w:val="22"/>
-          <w:szCs w:val="22"/>
-        </w:rPr>
-        <w:t xml:space="preserve">Najdôležitejšia obrazovka aplikácie: dispečer musí na jeden pohľad vidieť, kde sú kuriéri a ktoré zásielky meškajú. Rozloženie: hlavička (logo vľavo, vyhľadávanie, menu Monitoring / Reporty / Nastavenia, profil vpravo), pod ňou vľavo bočný panel a zvyšok obrazovky vypĺňa veľká mapa s pinmi kuriérov a zásielok. Bočný panel má dve záložky — </w:t>
-      </w:r>
+        <w:t>4.1 Prihlásenie / registrácia.</w:t>
+      </w:r>
+      <w:r>
+        <w:rPr>
+          <w:rFonts w:ascii="Calibri" w:hAnsi="Calibri" w:cs="Calibri"/>
+          <w:sz w:val="22"/>
+          <w:szCs w:val="22"/>
+        </w:rPr>
+        <w:t xml:space="preserve"> Najdôležitejšie: dostať používateľa čo najrýchlejšie dnu. Polia e-mail a heslo, tlačidlo „Prihlásiť sa" vedie na Monitoring; odkaz „Registrovať firmu" vedie na krátky registračný formulár (názov firmy, e-mail, heslo). Kurzor je po načítaní aktívny v poli e-mail.</w:t>
+      </w:r>
+    </w:p>
+    <w:p>
+      <w:pPr>
+        <w:pStyle w:val="Normlnywebov"/>
+        <w:rPr>
+          <w:rFonts w:ascii="Calibri" w:hAnsi="Calibri" w:cs="Calibri"/>
+          <w:sz w:val="22"/>
+          <w:szCs w:val="22"/>
+        </w:rPr>
+      </w:pPr>
       <w:r>
         <w:rPr>
           <w:rFonts w:ascii="Calibri" w:hAnsi="Calibri" w:cs="Calibri"/>
@@ -883,15 +960,15 @@
           <w:sz w:val="22"/>
           <w:szCs w:val="22"/>
         </w:rPr>
-        <w:t>Doručenia</w:t>
-      </w:r>
-      <w:r>
-        <w:rPr>
-          <w:rFonts w:ascii="Calibri" w:hAnsi="Calibri" w:cs="Calibri"/>
-          <w:sz w:val="22"/>
-          <w:szCs w:val="22"/>
-        </w:rPr>
-        <w:t xml:space="preserve"> a </w:t>
+        <w:t>4.2 Monitoring — hlavná obrazovka.</w:t>
+      </w:r>
+      <w:r>
+        <w:rPr>
+          <w:rFonts w:ascii="Calibri" w:hAnsi="Calibri" w:cs="Calibri"/>
+          <w:sz w:val="22"/>
+          <w:szCs w:val="22"/>
+        </w:rPr>
+        <w:t xml:space="preserve"> Najdôležitejšia obrazovka aplikácie: dispečer musí na jeden pohľad vidieť, kde sú kuriéri a ktoré zásielky meškajú. Rozloženie: hlavička (logo vľavo, vyhľadávanie, menu Monitoring / Reporty / Nastavenia, profil vpravo), pod ňou vľavo bočný panel a zvyšok obrazovky vypĺňa veľká mapa s pinmi kuriérov a zásielok. Bočný panel má dve záložky — </w:t>
       </w:r>
       <w:r>
         <w:rPr>
@@ -901,15 +978,15 @@
           <w:sz w:val="22"/>
           <w:szCs w:val="22"/>
         </w:rPr>
-        <w:t>Kuriéri</w:t>
-      </w:r>
-      <w:r>
-        <w:rPr>
-          <w:rFonts w:ascii="Calibri" w:hAnsi="Calibri" w:cs="Calibri"/>
-          <w:sz w:val="22"/>
-          <w:szCs w:val="22"/>
-        </w:rPr>
-        <w:t xml:space="preserve"> — a nad nimi výrazné tlačidlo </w:t>
+        <w:t>Doručenia</w:t>
+      </w:r>
+      <w:r>
+        <w:rPr>
+          <w:rFonts w:ascii="Calibri" w:hAnsi="Calibri" w:cs="Calibri"/>
+          <w:sz w:val="22"/>
+          <w:szCs w:val="22"/>
+        </w:rPr>
+        <w:t xml:space="preserve"> a </w:t>
       </w:r>
       <w:r>
         <w:rPr>
@@ -919,26 +996,16 @@
           <w:sz w:val="22"/>
           <w:szCs w:val="22"/>
         </w:rPr>
-        <w:t>„+ Nové doručenie"</w:t>
-      </w:r>
-      <w:r>
-        <w:rPr>
-          <w:rFonts w:ascii="Calibri" w:hAnsi="Calibri" w:cs="Calibri"/>
-          <w:sz w:val="22"/>
-          <w:szCs w:val="22"/>
-        </w:rPr>
-        <w:t>, ktoré otvorí modálne okno 4.3. Klik na kartu v paneli zvýrazní príslušný pin na mape.</w:t>
-      </w:r>
-    </w:p>
-    <w:p>
-      <w:pPr>
-        <w:pStyle w:val="Normlnywebov"/>
-        <w:rPr>
-          <w:rFonts w:ascii="Calibri" w:hAnsi="Calibri" w:cs="Calibri"/>
-          <w:sz w:val="22"/>
-          <w:szCs w:val="22"/>
-        </w:rPr>
-      </w:pPr>
+        <w:t>Kuriéri</w:t>
+      </w:r>
+      <w:r>
+        <w:rPr>
+          <w:rFonts w:ascii="Calibri" w:hAnsi="Calibri" w:cs="Calibri"/>
+          <w:sz w:val="22"/>
+          <w:szCs w:val="22"/>
+        </w:rPr>
+        <w:t xml:space="preserve"> — a nad nimi výrazné tlačidlo </w:t>
+      </w:r>
       <w:r>
         <w:rPr>
           <w:rFonts w:ascii="Calibri" w:hAnsi="Calibri" w:cs="Calibri"/>
@@ -947,24 +1014,103 @@
           <w:sz w:val="22"/>
           <w:szCs w:val="22"/>
         </w:rPr>
-        <w:t>4.3 Nové doručenie (modálne okno).</w:t>
-      </w:r>
-      <w:r>
-        <w:rPr>
-          <w:rFonts w:ascii="Calibri" w:hAnsi="Calibri" w:cs="Calibri"/>
-          <w:sz w:val="22"/>
-          <w:szCs w:val="22"/>
-        </w:rPr>
-        <w:t xml:space="preserve"> Formulár: meno príjemcu (povinné), adresa doručenia (povinné), adresa vyzdvihnutia (voliteľné), deadline (voliteľné), priradenie kuriéra (vybrať zo zoznamu </w:t>
-      </w:r>
-      <w:r>
-        <w:rPr>
-          <w:rFonts w:ascii="Calibri" w:hAnsi="Calibri" w:cs="Calibri"/>
-          <w:sz w:val="22"/>
-          <w:szCs w:val="22"/>
-        </w:rPr>
-        <w:lastRenderedPageBreak/>
-        <w:t>/ podľa kategórie), prepínač „povoliť automatické priradenie". Tlačidlo „Vytvoriť" zavrie okno a zásielka pribudne v zozname aj na mape; krížik zavrie okno bez uloženia. Kurzor je aktívny v prvom poli formulára.</w:t>
+        <w:t>„+ Nové doručenie"</w:t>
+      </w:r>
+      <w:r>
+        <w:rPr>
+          <w:rFonts w:ascii="Calibri" w:hAnsi="Calibri" w:cs="Calibri"/>
+          <w:sz w:val="22"/>
+          <w:szCs w:val="22"/>
+        </w:rPr>
+        <w:t>, ktoré otvorí modálne okno 4.3. Klik na kartu v paneli zvýrazní príslušný pin na mape.</w:t>
+      </w:r>
+    </w:p>
+    <w:p>
+      <w:pPr>
+        <w:pStyle w:val="Normlnywebov"/>
+        <w:rPr>
+          <w:rFonts w:ascii="Calibri" w:hAnsi="Calibri" w:cs="Calibri"/>
+          <w:sz w:val="22"/>
+          <w:szCs w:val="22"/>
+        </w:rPr>
+      </w:pPr>
+      <w:r>
+        <w:rPr>
+          <w:rFonts w:ascii="Calibri" w:hAnsi="Calibri" w:cs="Calibri"/>
+          <w:noProof/>
+          <w:sz w:val="22"/>
+          <w:szCs w:val="22"/>
+        </w:rPr>
+        <w:drawing>
+          <wp:inline distT="0" distB="0" distL="0" distR="0" wp14:anchorId="37B04A01" wp14:editId="2E78FE4D">
+            <wp:extent cx="5715000" cy="6867525"/>
+            <wp:effectExtent l="0" t="0" r="0" b="9525"/>
+            <wp:docPr id="2" name="Obrázok 2"/>
+            <wp:cNvGraphicFramePr>
+              <a:graphicFrameLocks xmlns:a="http://schemas.openxmlformats.org/drawingml/2006/main" noChangeAspect="1"/>
+            </wp:cNvGraphicFramePr>
+            <a:graphic xmlns:a="http://schemas.openxmlformats.org/drawingml/2006/main">
+              <a:graphicData uri="http://schemas.openxmlformats.org/drawingml/2006/picture">
+                <pic:pic xmlns:pic="http://schemas.openxmlformats.org/drawingml/2006/picture">
+                  <pic:nvPicPr>
+                    <pic:cNvPr id="0" name="Picture 2"/>
+                    <pic:cNvPicPr>
+                      <a:picLocks noChangeAspect="1" noChangeArrowheads="1"/>
+                    </pic:cNvPicPr>
+                  </pic:nvPicPr>
+                  <pic:blipFill>
+                    <a:blip r:embed="rId6">
+                      <a:extLst>
+                        <a:ext uri="{28A0092B-C50C-407E-A947-70E740481C1C}">
+                          <a14:useLocalDpi xmlns:a14="http://schemas.microsoft.com/office/drawing/2010/main" val="0"/>
+                        </a:ext>
+                      </a:extLst>
+                    </a:blip>
+                    <a:srcRect/>
+                    <a:stretch>
+                      <a:fillRect/>
+                    </a:stretch>
+                  </pic:blipFill>
+                  <pic:spPr bwMode="auto">
+                    <a:xfrm>
+                      <a:off x="0" y="0"/>
+                      <a:ext cx="5715000" cy="6867525"/>
+                    </a:xfrm>
+                    <a:prstGeom prst="rect">
+                      <a:avLst/>
+                    </a:prstGeom>
+                    <a:noFill/>
+                    <a:ln>
+                      <a:noFill/>
+                    </a:ln>
+                  </pic:spPr>
+                </pic:pic>
+              </a:graphicData>
+            </a:graphic>
+          </wp:inline>
+        </w:drawing>
+      </w:r>
+    </w:p>
+    <w:p>
+      <w:pPr>
+        <w:pStyle w:val="Normlnywebov"/>
+        <w:rPr>
+          <w:rFonts w:ascii="Calibri" w:hAnsi="Calibri" w:cs="Calibri"/>
+          <w:color w:val="555555"/>
+          <w:sz w:val="18"/>
+          <w:szCs w:val="18"/>
+        </w:rPr>
+      </w:pPr>
+      <w:r>
+        <w:rPr>
+          <w:rFonts w:ascii="Calibri" w:hAnsi="Calibri" w:cs="Calibri"/>
+          <w:i/>
+          <w:iCs/>
+          <w:color w:val="555555"/>
+          <w:sz w:val="18"/>
+          <w:szCs w:val="18"/>
+        </w:rPr>
+        <w:t>Obr. 2 — Monitoring v interaktívnom prototype (Axure): mapa, bočný panel so záložkami a tlačidlom na pridanie zásielky.</w:t>
       </w:r>
     </w:p>
     <w:p>
@@ -984,23 +1130,103 @@
           <w:sz w:val="22"/>
           <w:szCs w:val="22"/>
         </w:rPr>
-        <w:t>4.4 Karta doručenia</w:t>
-      </w:r>
-      <w:r>
-        <w:rPr>
-          <w:rFonts w:ascii="Calibri" w:hAnsi="Calibri" w:cs="Calibri"/>
-          <w:sz w:val="22"/>
-          <w:szCs w:val="22"/>
-        </w:rPr>
-        <w:t xml:space="preserve"> </w:t>
-      </w:r>
-      <w:r>
-        <w:rPr>
-          <w:rFonts w:ascii="Calibri" w:hAnsi="Calibri" w:cs="Calibri"/>
-          <w:sz w:val="22"/>
-          <w:szCs w:val="22"/>
-        </w:rPr>
-        <w:t>(v paneli, záložka Doručenia). Obsah: názov zásielky (klik otvorí detail), stav s indikátorom postupu (vytvorené → vyzdvihnuté → doručené), deadline, priradený kuriér s kontaktom. Akcie: vytvoriť kópiu doručenia, zmeniť kuriéra, zrušiť doručenie (s potvrdením). Po doručení pribudne tlačidlo „Stiahnuť foto doručenia".</w:t>
+        <w:t>4.3 Nové doručenie (modálne okno).</w:t>
+      </w:r>
+      <w:r>
+        <w:rPr>
+          <w:rFonts w:ascii="Calibri" w:hAnsi="Calibri" w:cs="Calibri"/>
+          <w:sz w:val="22"/>
+          <w:szCs w:val="22"/>
+        </w:rPr>
+        <w:t xml:space="preserve"> Formulár: meno príjemcu (povinné), adresa doručenia (povinné), adresa vyzdvihnutia (voliteľné), deadline (voliteľné), priradenie kuriéra (vybrať zo zoznamu / podľa kategórie), prepínač „povoliť automatické priradenie". Tlačidlo „Vytvoriť" zavrie okno a zásielka pribudne v zozname aj na mape; krížik zavrie okno bez uloženia. Kurzor je aktívny v prvom poli formulára.</w:t>
+      </w:r>
+    </w:p>
+    <w:p>
+      <w:pPr>
+        <w:pStyle w:val="Normlnywebov"/>
+        <w:rPr>
+          <w:rFonts w:ascii="Calibri" w:hAnsi="Calibri" w:cs="Calibri"/>
+          <w:sz w:val="22"/>
+          <w:szCs w:val="22"/>
+        </w:rPr>
+      </w:pPr>
+      <w:r>
+        <w:rPr>
+          <w:rFonts w:ascii="Calibri" w:hAnsi="Calibri" w:cs="Calibri"/>
+          <w:noProof/>
+          <w:sz w:val="22"/>
+          <w:szCs w:val="22"/>
+        </w:rPr>
+        <w:drawing>
+          <wp:inline distT="0" distB="0" distL="0" distR="0" wp14:anchorId="7152C826" wp14:editId="534D49A6">
+            <wp:extent cx="5715000" cy="6905625"/>
+            <wp:effectExtent l="0" t="0" r="0" b="9525"/>
+            <wp:docPr id="3" name="Obrázok 3"/>
+            <wp:cNvGraphicFramePr>
+              <a:graphicFrameLocks xmlns:a="http://schemas.openxmlformats.org/drawingml/2006/main" noChangeAspect="1"/>
+            </wp:cNvGraphicFramePr>
+            <a:graphic xmlns:a="http://schemas.openxmlformats.org/drawingml/2006/main">
+              <a:graphicData uri="http://schemas.openxmlformats.org/drawingml/2006/picture">
+                <pic:pic xmlns:pic="http://schemas.openxmlformats.org/drawingml/2006/picture">
+                  <pic:nvPicPr>
+                    <pic:cNvPr id="0" name="Picture 3"/>
+                    <pic:cNvPicPr>
+                      <a:picLocks noChangeAspect="1" noChangeArrowheads="1"/>
+                    </pic:cNvPicPr>
+                  </pic:nvPicPr>
+                  <pic:blipFill>
+                    <a:blip r:embed="rId7">
+                      <a:extLst>
+                        <a:ext uri="{28A0092B-C50C-407E-A947-70E740481C1C}">
+                          <a14:useLocalDpi xmlns:a14="http://schemas.microsoft.com/office/drawing/2010/main" val="0"/>
+                        </a:ext>
+                      </a:extLst>
+                    </a:blip>
+                    <a:srcRect/>
+                    <a:stretch>
+                      <a:fillRect/>
+                    </a:stretch>
+                  </pic:blipFill>
+                  <pic:spPr bwMode="auto">
+                    <a:xfrm>
+                      <a:off x="0" y="0"/>
+                      <a:ext cx="5715000" cy="6905625"/>
+                    </a:xfrm>
+                    <a:prstGeom prst="rect">
+                      <a:avLst/>
+                    </a:prstGeom>
+                    <a:noFill/>
+                    <a:ln>
+                      <a:noFill/>
+                    </a:ln>
+                  </pic:spPr>
+                </pic:pic>
+              </a:graphicData>
+            </a:graphic>
+          </wp:inline>
+        </w:drawing>
+      </w:r>
+    </w:p>
+    <w:p>
+      <w:pPr>
+        <w:pStyle w:val="Normlnywebov"/>
+        <w:rPr>
+          <w:rFonts w:ascii="Calibri" w:hAnsi="Calibri" w:cs="Calibri"/>
+          <w:color w:val="555555"/>
+          <w:sz w:val="18"/>
+          <w:szCs w:val="18"/>
+        </w:rPr>
+      </w:pPr>
+      <w:r>
+        <w:rPr>
+          <w:rFonts w:ascii="Calibri" w:hAnsi="Calibri" w:cs="Calibri"/>
+          <w:i/>
+          <w:iCs/>
+          <w:color w:val="555555"/>
+          <w:sz w:val="18"/>
+          <w:szCs w:val="18"/>
+        </w:rPr>
+        <w:t>Obr. 3 — Modálne okno vytvorenia zásielky nad stlmeným Monitoringom (interaktívny prototyp v Axure).</w:t>
       </w:r>
     </w:p>
     <w:p>
@@ -1020,7 +1246,7 @@
           <w:sz w:val="22"/>
           <w:szCs w:val="22"/>
         </w:rPr>
-        <w:t>4.5 Karta kuriéra</w:t>
+        <w:t>4.4 Karta doručenia</w:t>
       </w:r>
       <w:r>
         <w:rPr>
@@ -1036,7 +1262,7 @@
           <w:sz w:val="22"/>
           <w:szCs w:val="22"/>
         </w:rPr>
-        <w:t>(v paneli, záložka Kuriéri). Obsah: foto, meno, stav (voľný / na ceste), počet aktuálnych zákaziek, kategórie, krátke štatistiky. Akcie: „Poslať SMS", „Priradiť doručenie" (otvorí zoznam nepriradených zásielok), možnosť kuriéra zablokovať.</w:t>
+        <w:t>(v paneli, záložka Doručenia). Obsah: názov zásielky (klik otvorí detail), stav s indikátorom postupu (vytvorené → vyzdvihnuté → doručené), deadline, priradený kuriér s kontaktom. Akcie: vytvoriť kópiu doručenia, zmeniť kuriéra, zrušiť doručenie (s potvrdením). Po doručení pribudne tlačidlo „Stiahnuť foto doručenia".</w:t>
       </w:r>
     </w:p>
     <w:p>
@@ -1056,15 +1282,23 @@
           <w:sz w:val="22"/>
           <w:szCs w:val="22"/>
         </w:rPr>
-        <w:t>4.6 Reporty.</w:t>
-      </w:r>
-      <w:r>
-        <w:rPr>
-          <w:rFonts w:ascii="Calibri" w:hAnsi="Calibri" w:cs="Calibri"/>
-          <w:sz w:val="22"/>
-          <w:szCs w:val="22"/>
-        </w:rPr>
-        <w:t xml:space="preserve"> Grafy: počet doručení za deň/týždeň, priemerný čas doručenia, podiel zásielok doručených načas. Filter obdobia hore, tlačidlo „Exportovať" pre nadriadených.</w:t>
+        <w:t>4.5 Karta kuriéra</w:t>
+      </w:r>
+      <w:r>
+        <w:rPr>
+          <w:rFonts w:ascii="Calibri" w:hAnsi="Calibri" w:cs="Calibri"/>
+          <w:sz w:val="22"/>
+          <w:szCs w:val="22"/>
+        </w:rPr>
+        <w:t xml:space="preserve"> </w:t>
+      </w:r>
+      <w:r>
+        <w:rPr>
+          <w:rFonts w:ascii="Calibri" w:hAnsi="Calibri" w:cs="Calibri"/>
+          <w:sz w:val="22"/>
+          <w:szCs w:val="22"/>
+        </w:rPr>
+        <w:t>(v paneli, záložka Kuriéri). Obsah: foto, meno, stav (voľný / na ceste), počet aktuálnych zákaziek, kategórie, krátke štatistiky. Akcie: „Poslať SMS", „Priradiť doručenie" (otvorí zoznam nepriradených zásielok), možnosť kuriéra zablokovať.</w:t>
       </w:r>
     </w:p>
     <w:p>
@@ -1084,6 +1318,34 @@
           <w:sz w:val="22"/>
           <w:szCs w:val="22"/>
         </w:rPr>
+        <w:t>4.6 Reporty.</w:t>
+      </w:r>
+      <w:r>
+        <w:rPr>
+          <w:rFonts w:ascii="Calibri" w:hAnsi="Calibri" w:cs="Calibri"/>
+          <w:sz w:val="22"/>
+          <w:szCs w:val="22"/>
+        </w:rPr>
+        <w:t xml:space="preserve"> Grafy: počet doručení za deň/týždeň, priemerný čas doručenia, podiel zásielok doručených načas. Filter obdobia hore, tlačidlo „Exportovať" pre nadriadených.</w:t>
+      </w:r>
+    </w:p>
+    <w:p>
+      <w:pPr>
+        <w:pStyle w:val="Normlnywebov"/>
+        <w:rPr>
+          <w:rFonts w:ascii="Calibri" w:hAnsi="Calibri" w:cs="Calibri"/>
+          <w:sz w:val="22"/>
+          <w:szCs w:val="22"/>
+        </w:rPr>
+      </w:pPr>
+      <w:r>
+        <w:rPr>
+          <w:rFonts w:ascii="Calibri" w:hAnsi="Calibri" w:cs="Calibri"/>
+          <w:b/>
+          <w:bCs/>
+          <w:sz w:val="22"/>
+          <w:szCs w:val="22"/>
+        </w:rPr>
         <w:t>4.7 Nastavenia.</w:t>
       </w:r>
       <w:r>
@@ -1101,6 +1363,122 @@
           <w:szCs w:val="22"/>
         </w:rPr>
         <w:t>Profil spoločnosti, správa API kľúčov (vygenerovať / zrušiť — dôležité pre Martina a integrácie), odkaz na pomoc a podporu 24/7.</w:t>
+      </w:r>
+    </w:p>
+    <w:p>
+      <w:pPr>
+        <w:pStyle w:val="Normlnywebov"/>
+        <w:rPr>
+          <w:rFonts w:ascii="Calibri" w:hAnsi="Calibri" w:cs="Calibri"/>
+          <w:sz w:val="22"/>
+          <w:szCs w:val="22"/>
+        </w:rPr>
+      </w:pPr>
+      <w:r>
+        <w:rPr>
+          <w:rFonts w:ascii="Calibri" w:hAnsi="Calibri" w:cs="Calibri"/>
+          <w:b/>
+          <w:bCs/>
+          <w:sz w:val="22"/>
+          <w:szCs w:val="22"/>
+        </w:rPr>
+        <w:t>Interakcie v prototype.</w:t>
+      </w:r>
+      <w:r>
+        <w:rPr>
+          <w:rFonts w:ascii="Calibri" w:hAnsi="Calibri" w:cs="Calibri"/>
+          <w:sz w:val="22"/>
+          <w:szCs w:val="22"/>
+        </w:rPr>
+        <w:t xml:space="preserve"> Prototyp obsahuje oba požadované druhy interakcií: stránkovú (klik na profil zobrazí/skryje dropdown, klik na „Add a task" otvorí modálne okno) a štýlovú (položky menu menia pri prechode myšou farbu — MouseOver štýl).</w:t>
+      </w:r>
+    </w:p>
+    <w:p>
+      <w:pPr>
+        <w:pStyle w:val="Normlnywebov"/>
+        <w:rPr>
+          <w:rFonts w:ascii="Calibri" w:hAnsi="Calibri" w:cs="Calibri"/>
+          <w:sz w:val="22"/>
+          <w:szCs w:val="22"/>
+        </w:rPr>
+      </w:pPr>
+      <w:r>
+        <w:rPr>
+          <w:rFonts w:ascii="Calibri" w:hAnsi="Calibri" w:cs="Calibri"/>
+          <w:noProof/>
+          <w:sz w:val="22"/>
+          <w:szCs w:val="22"/>
+        </w:rPr>
+        <w:drawing>
+          <wp:inline distT="0" distB="0" distL="0" distR="0" wp14:anchorId="049AB6A8" wp14:editId="14441F3C">
+            <wp:extent cx="5720080" cy="8286750"/>
+            <wp:effectExtent l="0" t="0" r="0" b="0"/>
+            <wp:docPr id="4" name="Obrázok 4"/>
+            <wp:cNvGraphicFramePr>
+              <a:graphicFrameLocks xmlns:a="http://schemas.openxmlformats.org/drawingml/2006/main" noChangeAspect="1"/>
+            </wp:cNvGraphicFramePr>
+            <a:graphic xmlns:a="http://schemas.openxmlformats.org/drawingml/2006/main">
+              <a:graphicData uri="http://schemas.openxmlformats.org/drawingml/2006/picture">
+                <pic:pic xmlns:pic="http://schemas.openxmlformats.org/drawingml/2006/picture">
+                  <pic:nvPicPr>
+                    <pic:cNvPr id="0" name="Picture 4"/>
+                    <pic:cNvPicPr>
+                      <a:picLocks noChangeAspect="1" noChangeArrowheads="1"/>
+                    </pic:cNvPicPr>
+                  </pic:nvPicPr>
+                  <pic:blipFill>
+                    <a:blip r:embed="rId8">
+                      <a:extLst>
+                        <a:ext uri="{28A0092B-C50C-407E-A947-70E740481C1C}">
+                          <a14:useLocalDpi xmlns:a14="http://schemas.microsoft.com/office/drawing/2010/main" val="0"/>
+                        </a:ext>
+                      </a:extLst>
+                    </a:blip>
+                    <a:srcRect/>
+                    <a:stretch>
+                      <a:fillRect/>
+                    </a:stretch>
+                  </pic:blipFill>
+                  <pic:spPr bwMode="auto">
+                    <a:xfrm>
+                      <a:off x="0" y="0"/>
+                      <a:ext cx="5720080" cy="8286750"/>
+                    </a:xfrm>
+                    <a:prstGeom prst="rect">
+                      <a:avLst/>
+                    </a:prstGeom>
+                    <a:noFill/>
+                    <a:ln>
+                      <a:noFill/>
+                    </a:ln>
+                  </pic:spPr>
+                </pic:pic>
+              </a:graphicData>
+            </a:graphic>
+          </wp:inline>
+        </w:drawing>
+      </w:r>
+    </w:p>
+    <w:p>
+      <w:pPr>
+        <w:pStyle w:val="Normlnywebov"/>
+        <w:rPr>
+          <w:rFonts w:ascii="Calibri" w:hAnsi="Calibri" w:cs="Calibri"/>
+          <w:color w:val="555555"/>
+          <w:sz w:val="18"/>
+          <w:szCs w:val="18"/>
+        </w:rPr>
+      </w:pPr>
+      <w:r>
+        <w:rPr>
+          <w:rFonts w:ascii="Calibri" w:hAnsi="Calibri" w:cs="Calibri"/>
+          <w:i/>
+          <w:iCs/>
+          <w:color w:val="555555"/>
+          <w:sz w:val="18"/>
+          <w:szCs w:val="18"/>
+        </w:rPr>
+        <w:t>Obr. 4 — Nastavenie interakcií v Axure: stránková interakcia (Click or Tap → Show/Hide) a štýlová (MouseOver Style).</w:t>
       </w:r>
     </w:p>
     <w:p>
@@ -1240,9 +1618,158 @@
 <file path=word/numbering.xml><?xml version="1.0" encoding="utf-8"?>
 <w:numbering xmlns:wpc="http://schemas.microsoft.com/office/word/2010/wordprocessingCanvas" xmlns:cx="http://schemas.microsoft.com/office/drawing/2014/chartex" xmlns:cx1="http://schemas.microsoft.com/office/drawing/2015/9/8/chartex" xmlns:cx2="http://schemas.microsoft.com/office/drawing/2015/10/21/chartex" xmlns:cx3="http://schemas.microsoft.com/office/drawing/2016/5/9/chartex" xmlns:cx4="http://schemas.microsoft.com/office/drawing/2016/5/10/chartex" xmlns:cx5="http://schemas.microsoft.com/office/drawing/2016/5/11/chartex" xmlns:cx6="http://schemas.microsoft.com/office/drawing/2016/5/12/chartex" xmlns:cx7="http://schemas.microsoft.com/office/drawing/2016/5/13/chartex" xmlns:cx8="http://schemas.microsoft.com/office/drawing/2016/5/14/chartex" xmlns:mc="http://schemas.openxmlformats.org/markup-compatibility/2006" xmlns:aink="http://schemas.microsoft.com/office/drawing/2016/ink" xmlns:am3d="http://schemas.microsoft.com/office/drawing/2017/model3d" xmlns:o="urn:schemas-microsoft-com:office:office" xmlns:oel="http://schemas.microsoft.com/office/2019/extlst" xmlns:r="http://schemas.openxmlformats.org/officeDocument/2006/relationships" xmlns:m="http://schemas.openxmlformats.org/officeDocument/2006/math" xmlns:v="urn:schemas-microsoft-com:vml" xmlns:wp14="http://schemas.microsoft.com/office/word/2010/wordprocessingDrawing" xmlns:wp="http://schemas.openxmlformats.org/drawingml/2006/wordprocessingDrawing" xmlns:w10="urn:schemas-microsoft-com:office:word" xmlns:w="http://schemas.openxmlformats.org/wordprocessingml/2006/main" xmlns:w14="http://schemas.microsoft.com/office/word/2010/wordml" xmlns:w15="http://schemas.microsoft.com/office/word/2012/wordml" xmlns:w16cex="http://schemas.microsoft.com/office/word/2018/wordml/cex" xmlns:w16cid="http://schemas.microsoft.com/office/word/2016/wordml/cid" xmlns:w16="http://schemas.microsoft.com/office/word/2018/wordml" xmlns:w16du="http://schemas.microsoft.com/office/word/2023/wordml/word16du" xmlns:w16sdtdh="http://schemas.microsoft.com/office/word/2020/wordml/sdtdatahash" xmlns:w16sdtfl="http://schemas.microsoft.com/office/word/2024/wordml/sdtformatlock" xmlns:w16se="http://schemas.microsoft.com/office/word/2015/wordml/symex" xmlns:wpg="http://schemas.microsoft.com/office/word/2010/wordprocessingGroup" xmlns:wpi="http://schemas.microsoft.com/office/word/2010/wordprocessingInk" xmlns:wne="http://schemas.microsoft.com/office/word/2006/wordml" xmlns:wps="http://schemas.microsoft.com/office/word/2010/wordprocessingShape" mc:Ignorable="w14 w15 w16se w16cid w16 w16cex w16sdtdh w16sdtfl w16du wp14">
   <w:abstractNum w:abstractNumId="0" w15:restartNumberingAfterBreak="0">
-    <w:nsid w:val="486E77D9"/>
+    <w:nsid w:val="23552CE0"/>
     <w:multiLevelType w:val="multilevel"/>
-    <w:tmpl w:val="0DF034BA"/>
+    <w:tmpl w:val="A21A467A"/>
+    <w:lvl w:ilvl="0">
+      <w:start w:val="1"/>
+      <w:numFmt w:val="bullet"/>
+      <w:lvlText w:val=""/>
+      <w:lvlJc w:val="left"/>
+      <w:pPr>
+        <w:tabs>
+          <w:tab w:val="num" w:pos="720"/>
+        </w:tabs>
+        <w:ind w:left="720" w:hanging="360"/>
+      </w:pPr>
+      <w:rPr>
+        <w:rFonts w:ascii="Symbol" w:hAnsi="Symbol" w:hint="default"/>
+        <w:sz w:val="20"/>
+      </w:rPr>
+    </w:lvl>
+    <w:lvl w:ilvl="1">
+      <w:start w:val="1"/>
+      <w:numFmt w:val="bullet"/>
+      <w:lvlText w:val="o"/>
+      <w:lvlJc w:val="left"/>
+      <w:pPr>
+        <w:tabs>
+          <w:tab w:val="num" w:pos="1440"/>
+        </w:tabs>
+        <w:ind w:left="1440" w:hanging="360"/>
+      </w:pPr>
+      <w:rPr>
+        <w:rFonts w:ascii="Courier New" w:hAnsi="Courier New" w:hint="default"/>
+        <w:sz w:val="20"/>
+      </w:rPr>
+    </w:lvl>
+    <w:lvl w:ilvl="2" w:tentative="1">
+      <w:start w:val="1"/>
+      <w:numFmt w:val="bullet"/>
+      <w:lvlText w:val=""/>
+      <w:lvlJc w:val="left"/>
+      <w:pPr>
+        <w:tabs>
+          <w:tab w:val="num" w:pos="2160"/>
+        </w:tabs>
+        <w:ind w:left="2160" w:hanging="360"/>
+      </w:pPr>
+      <w:rPr>
+        <w:rFonts w:ascii="Wingdings" w:hAnsi="Wingdings" w:hint="default"/>
+        <w:sz w:val="20"/>
+      </w:rPr>
+    </w:lvl>
+    <w:lvl w:ilvl="3" w:tentative="1">
+      <w:start w:val="1"/>
+      <w:numFmt w:val="bullet"/>
+      <w:lvlText w:val=""/>
+      <w:lvlJc w:val="left"/>
+      <w:pPr>
+        <w:tabs>
+          <w:tab w:val="num" w:pos="2880"/>
+        </w:tabs>
+        <w:ind w:left="2880" w:hanging="360"/>
+      </w:pPr>
+      <w:rPr>
+        <w:rFonts w:ascii="Wingdings" w:hAnsi="Wingdings" w:hint="default"/>
+        <w:sz w:val="20"/>
+      </w:rPr>
+    </w:lvl>
+    <w:lvl w:ilvl="4" w:tentative="1">
+      <w:start w:val="1"/>
+      <w:numFmt w:val="bullet"/>
+      <w:lvlText w:val=""/>
+      <w:lvlJc w:val="left"/>
+      <w:pPr>
+        <w:tabs>
+          <w:tab w:val="num" w:pos="3600"/>
+        </w:tabs>
+        <w:ind w:left="3600" w:hanging="360"/>
+      </w:pPr>
+      <w:rPr>
+        <w:rFonts w:ascii="Wingdings" w:hAnsi="Wingdings" w:hint="default"/>
+        <w:sz w:val="20"/>
+      </w:rPr>
+    </w:lvl>
+    <w:lvl w:ilvl="5" w:tentative="1">
+      <w:start w:val="1"/>
+      <w:numFmt w:val="bullet"/>
+      <w:lvlText w:val=""/>
+      <w:lvlJc w:val="left"/>
+      <w:pPr>
+        <w:tabs>
+          <w:tab w:val="num" w:pos="4320"/>
+        </w:tabs>
+        <w:ind w:left="4320" w:hanging="360"/>
+      </w:pPr>
+      <w:rPr>
+        <w:rFonts w:ascii="Wingdings" w:hAnsi="Wingdings" w:hint="default"/>
+        <w:sz w:val="20"/>
+      </w:rPr>
+    </w:lvl>
+    <w:lvl w:ilvl="6" w:tentative="1">
+      <w:start w:val="1"/>
+      <w:numFmt w:val="bullet"/>
+      <w:lvlText w:val=""/>
+      <w:lvlJc w:val="left"/>
+      <w:pPr>
+        <w:tabs>
+          <w:tab w:val="num" w:pos="5040"/>
+        </w:tabs>
+        <w:ind w:left="5040" w:hanging="360"/>
+      </w:pPr>
+      <w:rPr>
+        <w:rFonts w:ascii="Wingdings" w:hAnsi="Wingdings" w:hint="default"/>
+        <w:sz w:val="20"/>
+      </w:rPr>
+    </w:lvl>
+    <w:lvl w:ilvl="7" w:tentative="1">
+      <w:start w:val="1"/>
+      <w:numFmt w:val="bullet"/>
+      <w:lvlText w:val=""/>
+      <w:lvlJc w:val="left"/>
+      <w:pPr>
+        <w:tabs>
+          <w:tab w:val="num" w:pos="5760"/>
+        </w:tabs>
+        <w:ind w:left="5760" w:hanging="360"/>
+      </w:pPr>
+      <w:rPr>
+        <w:rFonts w:ascii="Wingdings" w:hAnsi="Wingdings" w:hint="default"/>
+        <w:sz w:val="20"/>
+      </w:rPr>
+    </w:lvl>
+    <w:lvl w:ilvl="8" w:tentative="1">
+      <w:start w:val="1"/>
+      <w:numFmt w:val="bullet"/>
+      <w:lvlText w:val=""/>
+      <w:lvlJc w:val="left"/>
+      <w:pPr>
+        <w:tabs>
+          <w:tab w:val="num" w:pos="6480"/>
+        </w:tabs>
+        <w:ind w:left="6480" w:hanging="360"/>
+      </w:pPr>
+      <w:rPr>
+        <w:rFonts w:ascii="Wingdings" w:hAnsi="Wingdings" w:hint="default"/>
+        <w:sz w:val="20"/>
+      </w:rPr>
+    </w:lvl>
+  </w:abstractNum>
+  <w:abstractNum w:abstractNumId="1" w15:restartNumberingAfterBreak="0">
+    <w:nsid w:val="51B849BB"/>
+    <w:multiLevelType w:val="multilevel"/>
+    <w:tmpl w:val="7F44C542"/>
     <w:lvl w:ilvl="0">
       <w:start w:val="1"/>
       <w:numFmt w:val="bullet"/>
@@ -1388,160 +1915,11 @@
       </w:rPr>
     </w:lvl>
   </w:abstractNum>
-  <w:abstractNum w:abstractNumId="1" w15:restartNumberingAfterBreak="0">
-    <w:nsid w:val="687E085C"/>
-    <w:multiLevelType w:val="multilevel"/>
-    <w:tmpl w:val="E3A83620"/>
-    <w:lvl w:ilvl="0">
-      <w:start w:val="1"/>
-      <w:numFmt w:val="bullet"/>
-      <w:lvlText w:val=""/>
-      <w:lvlJc w:val="left"/>
-      <w:pPr>
-        <w:tabs>
-          <w:tab w:val="num" w:pos="720"/>
-        </w:tabs>
-        <w:ind w:left="720" w:hanging="360"/>
-      </w:pPr>
-      <w:rPr>
-        <w:rFonts w:ascii="Symbol" w:hAnsi="Symbol" w:hint="default"/>
-        <w:sz w:val="20"/>
-      </w:rPr>
-    </w:lvl>
-    <w:lvl w:ilvl="1">
-      <w:start w:val="1"/>
-      <w:numFmt w:val="bullet"/>
-      <w:lvlText w:val="o"/>
-      <w:lvlJc w:val="left"/>
-      <w:pPr>
-        <w:tabs>
-          <w:tab w:val="num" w:pos="1440"/>
-        </w:tabs>
-        <w:ind w:left="1440" w:hanging="360"/>
-      </w:pPr>
-      <w:rPr>
-        <w:rFonts w:ascii="Courier New" w:hAnsi="Courier New" w:hint="default"/>
-        <w:sz w:val="20"/>
-      </w:rPr>
-    </w:lvl>
-    <w:lvl w:ilvl="2" w:tentative="1">
-      <w:start w:val="1"/>
-      <w:numFmt w:val="bullet"/>
-      <w:lvlText w:val=""/>
-      <w:lvlJc w:val="left"/>
-      <w:pPr>
-        <w:tabs>
-          <w:tab w:val="num" w:pos="2160"/>
-        </w:tabs>
-        <w:ind w:left="2160" w:hanging="360"/>
-      </w:pPr>
-      <w:rPr>
-        <w:rFonts w:ascii="Wingdings" w:hAnsi="Wingdings" w:hint="default"/>
-        <w:sz w:val="20"/>
-      </w:rPr>
-    </w:lvl>
-    <w:lvl w:ilvl="3" w:tentative="1">
-      <w:start w:val="1"/>
-      <w:numFmt w:val="bullet"/>
-      <w:lvlText w:val=""/>
-      <w:lvlJc w:val="left"/>
-      <w:pPr>
-        <w:tabs>
-          <w:tab w:val="num" w:pos="2880"/>
-        </w:tabs>
-        <w:ind w:left="2880" w:hanging="360"/>
-      </w:pPr>
-      <w:rPr>
-        <w:rFonts w:ascii="Wingdings" w:hAnsi="Wingdings" w:hint="default"/>
-        <w:sz w:val="20"/>
-      </w:rPr>
-    </w:lvl>
-    <w:lvl w:ilvl="4" w:tentative="1">
-      <w:start w:val="1"/>
-      <w:numFmt w:val="bullet"/>
-      <w:lvlText w:val=""/>
-      <w:lvlJc w:val="left"/>
-      <w:pPr>
-        <w:tabs>
-          <w:tab w:val="num" w:pos="3600"/>
-        </w:tabs>
-        <w:ind w:left="3600" w:hanging="360"/>
-      </w:pPr>
-      <w:rPr>
-        <w:rFonts w:ascii="Wingdings" w:hAnsi="Wingdings" w:hint="default"/>
-        <w:sz w:val="20"/>
-      </w:rPr>
-    </w:lvl>
-    <w:lvl w:ilvl="5" w:tentative="1">
-      <w:start w:val="1"/>
-      <w:numFmt w:val="bullet"/>
-      <w:lvlText w:val=""/>
-      <w:lvlJc w:val="left"/>
-      <w:pPr>
-        <w:tabs>
-          <w:tab w:val="num" w:pos="4320"/>
-        </w:tabs>
-        <w:ind w:left="4320" w:hanging="360"/>
-      </w:pPr>
-      <w:rPr>
-        <w:rFonts w:ascii="Wingdings" w:hAnsi="Wingdings" w:hint="default"/>
-        <w:sz w:val="20"/>
-      </w:rPr>
-    </w:lvl>
-    <w:lvl w:ilvl="6" w:tentative="1">
-      <w:start w:val="1"/>
-      <w:numFmt w:val="bullet"/>
-      <w:lvlText w:val=""/>
-      <w:lvlJc w:val="left"/>
-      <w:pPr>
-        <w:tabs>
-          <w:tab w:val="num" w:pos="5040"/>
-        </w:tabs>
-        <w:ind w:left="5040" w:hanging="360"/>
-      </w:pPr>
-      <w:rPr>
-        <w:rFonts w:ascii="Wingdings" w:hAnsi="Wingdings" w:hint="default"/>
-        <w:sz w:val="20"/>
-      </w:rPr>
-    </w:lvl>
-    <w:lvl w:ilvl="7" w:tentative="1">
-      <w:start w:val="1"/>
-      <w:numFmt w:val="bullet"/>
-      <w:lvlText w:val=""/>
-      <w:lvlJc w:val="left"/>
-      <w:pPr>
-        <w:tabs>
-          <w:tab w:val="num" w:pos="5760"/>
-        </w:tabs>
-        <w:ind w:left="5760" w:hanging="360"/>
-      </w:pPr>
-      <w:rPr>
-        <w:rFonts w:ascii="Wingdings" w:hAnsi="Wingdings" w:hint="default"/>
-        <w:sz w:val="20"/>
-      </w:rPr>
-    </w:lvl>
-    <w:lvl w:ilvl="8" w:tentative="1">
-      <w:start w:val="1"/>
-      <w:numFmt w:val="bullet"/>
-      <w:lvlText w:val=""/>
-      <w:lvlJc w:val="left"/>
-      <w:pPr>
-        <w:tabs>
-          <w:tab w:val="num" w:pos="6480"/>
-        </w:tabs>
-        <w:ind w:left="6480" w:hanging="360"/>
-      </w:pPr>
-      <w:rPr>
-        <w:rFonts w:ascii="Wingdings" w:hAnsi="Wingdings" w:hint="default"/>
-        <w:sz w:val="20"/>
-      </w:rPr>
-    </w:lvl>
-  </w:abstractNum>
-  <w:num w:numId="1" w16cid:durableId="1645693895">
+  <w:num w:numId="1" w16cid:durableId="360866357">
+    <w:abstractNumId w:val="0"/>
+  </w:num>
+  <w:num w:numId="2" w16cid:durableId="2088308107">
     <w:abstractNumId w:val="1"/>
-  </w:num>
-  <w:num w:numId="2" w16cid:durableId="600382447">
-    <w:abstractNumId w:val="0"/>
   </w:num>
 </w:numbering>
 </file>

</xml_diff>